<commit_message>
Add GitHub repository link to report and README
</commit_message>
<xml_diff>
--- a/reports/BLM308_Final_Report.docx
+++ b/reports/BLM308_Final_Report.docx
@@ -55,6 +55,15 @@
           <w:sz w:val="22"/>
         </w:rPr>
         <w:t>Teslim Tarihi: Mayıs 2026</w:t>
+      </w:r>
+    </w:p>
+    <w:p>
+      <w:r>
+        <w:rPr>
+          <w:b w:val="0"/>
+          <w:sz w:val="22"/>
+        </w:rPr>
+        <w:t>GitHub Deposu: https://github.com/emrekayy/blm308-urun-iade-tahmini</w:t>
       </w:r>
     </w:p>
     <w:p>

</xml_diff>

<commit_message>
Remove AI usage statement and Cursor references from reports
</commit_message>
<xml_diff>
--- a/reports/BLM308_Final_Report.docx
+++ b/reports/BLM308_Final_Report.docx
@@ -1345,24 +1345,7 @@
         <w:pStyle w:val="Heading1"/>
       </w:pPr>
       <w:r>
-        <w:t>16. Yapay Zeka Kullanım Beyanı</w:t>
-      </w:r>
-    </w:p>
-    <w:p>
-      <w:r>
-        <w:rPr>
-          <w:b w:val="0"/>
-          <w:sz w:val="22"/>
-        </w:rPr>
-        <w:t>Proje yapılırken yapay zeka araçlarından yararlanılmıştır.</w:t>
-      </w:r>
-    </w:p>
-    <w:p>
-      <w:pPr>
-        <w:pStyle w:val="Heading1"/>
-      </w:pPr>
-      <w:r>
-        <w:t>17. Kaynaklar</w:t>
+        <w:t>16. Kaynaklar</w:t>
       </w:r>
     </w:p>
     <w:p>

</xml_diff>

<commit_message>
Restore minimal AI usage statement in report
</commit_message>
<xml_diff>
--- a/reports/BLM308_Final_Report.docx
+++ b/reports/BLM308_Final_Report.docx
@@ -1345,7 +1345,24 @@
         <w:pStyle w:val="Heading1"/>
       </w:pPr>
       <w:r>
-        <w:t>16. Kaynaklar</w:t>
+        <w:t>16. Yapay Zeka Kullanım Beyanı</w:t>
+      </w:r>
+    </w:p>
+    <w:p>
+      <w:r>
+        <w:rPr>
+          <w:b w:val="0"/>
+          <w:sz w:val="22"/>
+        </w:rPr>
+        <w:t>Yapay zeka araçları kullanılmıştır.</w:t>
+      </w:r>
+    </w:p>
+    <w:p>
+      <w:pPr>
+        <w:pStyle w:val="Heading1"/>
+      </w:pPr>
+      <w:r>
+        <w:t>17. Kaynaklar</w:t>
       </w:r>
     </w:p>
     <w:p>

</xml_diff>